<commit_message>
Fixes daylight savings time for Mailchimp. Add WSP renewal template
</commit_message>
<xml_diff>
--- a/CUWebinars.Web/App_Data/mergeTemplates/OrderSubmitted_WSPSubscription.docx
+++ b/CUWebinars.Web/App_Data/mergeTemplates/OrderSubmitted_WSPSubscription.docx
@@ -140,8 +140,8 @@
               <w:tblLook w:val="04A0" w:firstRow="1" w:lastRow="0" w:firstColumn="1" w:lastColumn="0" w:noHBand="0" w:noVBand="1"/>
             </w:tblPr>
             <w:tblGrid>
-              <w:gridCol w:w="1115"/>
-              <w:gridCol w:w="1504"/>
+              <w:gridCol w:w="795"/>
+              <w:gridCol w:w="1505"/>
             </w:tblGrid>
             <w:tr>
               <w:tc>
@@ -321,7 +321,7 @@
                       <w:sz w:val="18"/>
                       <w:szCs w:val="18"/>
                     </w:rPr>
-                    <w:t>Level</w:t>
+                    <w:t>Credits</w:t>
                   </w:r>
                   <w:r>
                     <w:rPr>
@@ -358,7 +358,7 @@
                       <w:sz w:val="18"/>
                       <w:szCs w:val="18"/>
                     </w:rPr>
-                    <w:instrText xml:space="preserve"> MERGEFIELD  AttendType  \* MERGEFORMAT </w:instrText>
+                    <w:instrText xml:space="preserve"> MERGEFIELD  WSPTotal  \* MERGEFORMAT </w:instrText>
                   </w:r>
                   <w:r>
                     <w:rPr>
@@ -373,7 +373,7 @@
                       <w:sz w:val="18"/>
                       <w:szCs w:val="18"/>
                     </w:rPr>
-                    <w:t>«AttendType»</w:t>
+                    <w:t>«WSPTotal»</w:t>
                   </w:r>
                   <w:r>
                     <w:rPr>
@@ -536,53 +536,274 @@
             <w:r>
               <w:t xml:space="preserve">Dear </w:t>
             </w:r>
-            <w:fldSimple w:instr=" MERGEFIELD  FirstName  \* MERGEFORMAT ">
+            <w:r>
+              <w:fldChar w:fldCharType="begin"/>
+            </w:r>
+            <w:r>
+              <w:instrText xml:space="preserve"> MERGEFIELD  FirstName  \* MERGEFORMAT </w:instrText>
+            </w:r>
+            <w:r>
+              <w:fldChar w:fldCharType="separate"/>
+            </w:r>
+            <w:r>
+              <w:rPr>
+                <w:noProof/>
+              </w:rPr>
+              <w:t>«FirstName»</w:t>
+            </w:r>
+            <w:r>
+              <w:rPr>
+                <w:noProof/>
+              </w:rPr>
+              <w:fldChar w:fldCharType="end"/>
+            </w:r>
+            <w:r>
+              <w:t>,</w:t>
+            </w:r>
+          </w:p>
+          <w:p/>
+          <w:p>
+            <w:r>
+              <w:t xml:space="preserve">Thank you for your purchase of our </w:t>
+            </w:r>
+            <w:r>
+              <w:rPr>
+                <w:b/>
+              </w:rPr>
+              <w:t>Webinar Subscription Package (WSP)</w:t>
+            </w:r>
+            <w:r>
+              <w:t>. Your subscription code is</w:t>
+            </w:r>
+            <w:r>
+              <w:t xml:space="preserve"> </w:t>
+            </w:r>
+            <w:fldSimple w:instr=" MERGEFIELD  WSPCode  \* MERGEFORMAT ">
               <w:r>
                 <w:rPr>
                   <w:noProof/>
                 </w:rPr>
-                <w:t>«FirstName»</w:t>
+                <w:t>«WSPCode»</w:t>
               </w:r>
             </w:fldSimple>
             <w:r>
+              <w:t xml:space="preserve">  and is activated - ready to use!</w:t>
+            </w:r>
+          </w:p>
+          <w:p>
+            <w:pPr>
+              <w:rPr>
+                <w:i/>
+              </w:rPr>
+            </w:pPr>
+          </w:p>
+          <w:p>
+            <w:pPr>
+              <w:rPr>
+                <w:i/>
+              </w:rPr>
+            </w:pPr>
+            <w:r>
+              <w:rPr>
+                <w:i/>
+              </w:rPr>
+              <w:t>How to use your subscription package:</w:t>
+            </w:r>
+          </w:p>
+          <w:p>
+            <w:pPr>
+              <w:rPr>
+                <w:b/>
+                <w:i/>
+              </w:rPr>
+            </w:pPr>
+            <w:r>
+              <w:rPr>
+                <w:b/>
+              </w:rPr>
+              <w:t>If you are the original registrant</w:t>
+            </w:r>
+            <w:r>
+              <w:t xml:space="preserve"> (</w:t>
+            </w:r>
+            <w:r>
+              <w:fldChar w:fldCharType="begin"/>
+            </w:r>
+            <w:r>
+              <w:instrText xml:space="preserve"> MERGEFIELD  BillingEmail  \* MERGEFORMAT </w:instrText>
+            </w:r>
+            <w:r>
+              <w:fldChar w:fldCharType="separate"/>
+            </w:r>
+            <w:r>
+              <w:rPr>
+                <w:noProof/>
+              </w:rPr>
+              <w:t>«</w:t>
+            </w:r>
+            <w:proofErr w:type="spellStart"/>
+            <w:r>
+              <w:rPr>
+                <w:noProof/>
+              </w:rPr>
+              <w:t>BillingEmail</w:t>
+            </w:r>
+            <w:proofErr w:type="spellEnd"/>
+            <w:r>
+              <w:rPr>
+                <w:noProof/>
+              </w:rPr>
+              <w:t>»</w:t>
+            </w:r>
+            <w:r>
+              <w:fldChar w:fldCharType="end"/>
+            </w:r>
+            <w:r>
+              <w:t>)</w:t>
+            </w:r>
+            <w:r>
               <w:t>,</w:t>
+            </w:r>
+            <w:r>
+              <w:t xml:space="preserve"> ou</w:t>
+            </w:r>
+            <w:r>
+              <w:t>r</w:t>
+            </w:r>
+            <w:r>
+              <w:t xml:space="preserve"> checkout cart will automatically apply </w:t>
+            </w:r>
+            <w:r>
+              <w:t xml:space="preserve">your WSP credits </w:t>
+            </w:r>
+            <w:r>
+              <w:t>(though you can optionally choose to Pay By Credit Card)</w:t>
+            </w:r>
+            <w:r>
+              <w:t>.</w:t>
             </w:r>
           </w:p>
           <w:p/>
           <w:p>
             <w:r>
-              <w:t xml:space="preserve">Thank you for your </w:t>
-            </w:r>
-            <w:r>
-              <w:t xml:space="preserve">purchase of our </w:t>
+              <w:rPr>
+                <w:b/>
+              </w:rPr>
+              <w:t>If you are not the original registrant</w:t>
+            </w:r>
+            <w:r>
+              <w:t>,</w:t>
+            </w:r>
+            <w:r>
+              <w:t xml:space="preserve"> during checkout</w:t>
+            </w:r>
+            <w:r>
+              <w:t xml:space="preserve"> look for the button labeled </w:t>
             </w:r>
             <w:r>
               <w:rPr>
                 <w:b/>
                 <w:i/>
               </w:rPr>
-              <w:t>Webinar Subscription Package</w:t>
-            </w:r>
-            <w:r>
-              <w:t xml:space="preserve">. </w:t>
+              <w:t>Add Discount?</w:t>
+            </w:r>
+            <w:r>
+              <w:t xml:space="preserve"> </w:t>
+            </w:r>
+            <w:r>
+              <w:t>a</w:t>
+            </w:r>
+            <w:r>
+              <w:t xml:space="preserve">nd </w:t>
+            </w:r>
+            <w:r>
+              <w:t xml:space="preserve">enter your </w:t>
+            </w:r>
+            <w:r>
+              <w:t xml:space="preserve">code </w:t>
+            </w:r>
+            <w:r>
+              <w:t>(</w:t>
+            </w:r>
+            <w:r>
+              <w:fldChar w:fldCharType="begin"/>
+            </w:r>
+            <w:r>
+              <w:instrText xml:space="preserve"> MERGEFIELD  WSPCode  \* MERGEFORMAT </w:instrText>
+            </w:r>
+            <w:r>
+              <w:fldChar w:fldCharType="separate"/>
+            </w:r>
+            <w:r>
+              <w:rPr>
+                <w:noProof/>
+              </w:rPr>
+              <w:t>«</w:t>
+            </w:r>
+            <w:proofErr w:type="spellStart"/>
+            <w:r>
+              <w:rPr>
+                <w:noProof/>
+              </w:rPr>
+              <w:t>WSPCode</w:t>
+            </w:r>
+            <w:proofErr w:type="spellEnd"/>
+            <w:r>
+              <w:rPr>
+                <w:noProof/>
+              </w:rPr>
+              <w:t>»</w:t>
+            </w:r>
+            <w:r>
+              <w:fldChar w:fldCharType="end"/>
+            </w:r>
+            <w:r>
+              <w:t xml:space="preserve">). </w:t>
             </w:r>
           </w:p>
           <w:p/>
           <w:p>
+            <w:r>
+              <w:rPr>
+                <w:i/>
+              </w:rPr>
+              <w:t>*NOTE</w:t>
+            </w:r>
+            <w:r>
+              <w:t>: If you would like additional addresses to have the same auto-apply rights as you just get in touch with us (info@ttsTrain.com) and we will be happy to add them.</w:t>
+            </w:r>
+          </w:p>
+          <w:p/>
+          <w:bookmarkStart w:id="2" w:name="_GoBack"/>
+          <w:bookmarkEnd w:id="2"/>
+          <w:p>
             <w:pPr>
               <w:rPr>
                 <w:b/>
                 <w:i/>
               </w:rPr>
             </w:pPr>
-            <w:fldSimple w:instr=" MERGEFIELD  PaymentCaption  \* MERGEFORMAT ">
-              <w:r>
-                <w:rPr>
-                  <w:noProof/>
-                </w:rPr>
-                <w:t>«PaymentCaption»</w:t>
-              </w:r>
-            </w:fldSimple>
+            <w:r>
+              <w:fldChar w:fldCharType="begin"/>
+            </w:r>
+            <w:r>
+              <w:instrText xml:space="preserve"> MERGEFIELD  PaymentCaption  \* MERGEFORMAT </w:instrText>
+            </w:r>
+            <w:r>
+              <w:fldChar w:fldCharType="separate"/>
+            </w:r>
+            <w:r>
+              <w:rPr>
+                <w:noProof/>
+              </w:rPr>
+              <w:t>«PaymentCation»</w:t>
+            </w:r>
+            <w:r>
+              <w:rPr>
+                <w:noProof/>
+              </w:rPr>
+              <w:fldChar w:fldCharType="end"/>
+            </w:r>
           </w:p>
           <w:p>
             <w:pPr>
@@ -631,7 +852,7 @@
               <w:tblLook w:val="04A0" w:firstRow="1" w:lastRow="0" w:firstColumn="1" w:lastColumn="0" w:noHBand="0" w:noVBand="1"/>
             </w:tblPr>
             <w:tblGrid>
-              <w:gridCol w:w="8619"/>
+              <w:gridCol w:w="8605"/>
             </w:tblGrid>
             <w:tr>
               <w:tc>
@@ -653,8 +874,8 @@
                     <w:tblLook w:val="04A0" w:firstRow="1" w:lastRow="0" w:firstColumn="1" w:lastColumn="0" w:noHBand="0" w:noVBand="1"/>
                   </w:tblPr>
                   <w:tblGrid>
-                    <w:gridCol w:w="4183"/>
-                    <w:gridCol w:w="4194"/>
+                    <w:gridCol w:w="4181"/>
+                    <w:gridCol w:w="4198"/>
                   </w:tblGrid>
                   <w:tr>
                     <w:tc>
@@ -754,8 +975,6 @@
                             <w:szCs w:val="18"/>
                           </w:rPr>
                         </w:pPr>
-                        <w:bookmarkStart w:id="2" w:name="_GoBack"/>
-                        <w:bookmarkEnd w:id="2"/>
                         <w:r>
                           <w:rPr>
                             <w:rFonts w:eastAsia="Times New Roman" w:cs="Times New Roman"/>
@@ -1273,7 +1492,7 @@
   <w:style w:type="paragraph" w:default="1" w:styleId="Normal">
     <w:name w:val="Normal"/>
     <w:qFormat/>
-    <w:rsid w:val="00504530"/>
+    <w:rsid w:val="00B97503"/>
   </w:style>
   <w:style w:type="character" w:default="1" w:styleId="DefaultParagraphFont">
     <w:name w:val="Default Paragraph Font"/>
@@ -1322,7 +1541,6 @@
     <w:name w:val="Hyperlink"/>
     <w:basedOn w:val="DefaultParagraphFont"/>
     <w:uiPriority w:val="99"/>
-    <w:semiHidden/>
     <w:unhideWhenUsed/>
     <w:rsid w:val="00226AB3"/>
     <w:rPr>
@@ -1372,6 +1590,18 @@
     <w:pPr>
       <w:spacing w:after="0" w:line="240" w:lineRule="auto"/>
     </w:pPr>
+  </w:style>
+  <w:style w:type="character" w:styleId="UnresolvedMention">
+    <w:name w:val="Unresolved Mention"/>
+    <w:basedOn w:val="DefaultParagraphFont"/>
+    <w:uiPriority w:val="99"/>
+    <w:semiHidden/>
+    <w:unhideWhenUsed/>
+    <w:rsid w:val="009E38BF"/>
+    <w:rPr>
+      <w:color w:val="808080"/>
+      <w:shd w:val="clear" w:color="auto" w:fill="E6E6E6"/>
+    </w:rPr>
   </w:style>
 </w:styles>
 </file>
@@ -1642,7 +1872,7 @@
 </file>
 
 <file path=customXml/itemProps1.xml><?xml version="1.0" encoding="utf-8"?>
-<ds:datastoreItem xmlns:ds="http://schemas.openxmlformats.org/officeDocument/2006/customXml" ds:itemID="{DEDF5339-8482-405F-963F-49A56D021EE1}">
+<ds:datastoreItem xmlns:ds="http://schemas.openxmlformats.org/officeDocument/2006/customXml" ds:itemID="{016C01E2-74C3-4AD5-8524-9851F4C367AA}">
   <ds:schemaRefs>
     <ds:schemaRef ds:uri="http://schemas.openxmlformats.org/officeDocument/2006/bibliography"/>
   </ds:schemaRefs>

</xml_diff>